<commit_message>
Fix Section 5 dashboard question to match what the data actually supports
Reworded 'which players are driving scoring trends' to a top-scorers
leaderboard question, and updated the matching visual — the free API
gives season-total scorer data, not per-match goal events, so a true
player-level trend line isn't something we can honestly promise.
</commit_message>
<xml_diff>
--- a/docs/Phase1_Project_Proposal.docx
+++ b/docs/Phase1_Project_Proposal.docx
@@ -1795,7 +1795,7 @@
           <w:sz w:val="22"/>
           <w:szCs w:val="22"/>
         </w:rPr>
-        <w:t xml:space="preserve">Which teams/players are driving scoring trends across a league or competition?</w:t>
+        <w:t>Who are this season's top scorers across the tracked leagues, and which teams are they concentrated in?</w:t>
       </w:r>
     </w:p>
     <w:p>
@@ -1882,14 +1882,13 @@
           <w:sz w:val="22"/>
           <w:szCs w:val="22"/>
         </w:rPr>
-        <w:t xml:space="preserve">Goal-scoring trend heatmap: </w:t>
-      </w:r>
-      <w:r>
-        <w:rPr>
-          <w:sz w:val="22"/>
-          <w:szCs w:val="22"/>
-        </w:rPr>
-        <w:t xml:space="preserve">a matrix/heatmap of goals scored per team per matchday (or month), highlighting scoring streaks and slumps, sourced from fact_matches.</w:t>
+        <w:t>Top scorers leaderboard &amp; team goal-scoring heatmap: a bar chart ranking this season's leading scorers by team (fact_top_scorers), alongside a matrix/heatmap of goals scored per team per matchday, highlighting scoring streaks and slumps at the team level (fact_matches).</w:t>
+      </w:r>
+      <w:r>
+        <w:rPr>
+          <w:sz w:val="22"/>
+          <w:szCs w:val="22"/>
+        </w:rPr>
       </w:r>
     </w:p>
     <w:p>

</xml_diff>

<commit_message>
Add group member names/roll numbers to proposal cover page
</commit_message>
<xml_diff>
--- a/docs/Phase1_Project_Proposal.docx
+++ b/docs/Phase1_Project_Proposal.docx
@@ -334,6 +334,11 @@
     <w:p>
       <w:r>
         <w:br w:type="page"/>
+      </w:r>
+    </w:p>
+    <w:p>
+      <w:r>
+        <w:t>Group Members: Abdullah (23L-2611, BDS-7A), Usaid Chaudhary (23L-2538)</w:t>
       </w:r>
     </w:p>
     <w:p>

</xml_diff>

<commit_message>
Add submission date and direct dataset folder link to proposal
</commit_message>
<xml_diff>
--- a/docs/Phase1_Project_Proposal.docx
+++ b/docs/Phase1_Project_Proposal.docx
@@ -334,6 +334,11 @@
     <w:p>
       <w:r>
         <w:br w:type="page"/>
+      </w:r>
+    </w:p>
+    <w:p>
+      <w:r>
+        <w:t>Submission Date: 2026-09-27</w:t>
       </w:r>
     </w:p>
     <w:p>
@@ -1937,7 +1942,7 @@
           <w:sz w:val="22"/>
           <w:szCs w:val="22"/>
         </w:rPr>
-        <w:t>A GitHub repository hosts the project code (Spark notebooks/scripts for Bronze/Silver/Gold), the real sample raw data files (/data/samples/), API verification and volume-estimate documentation (/docs/), and this proposal document. Repository link: https://github.com/AbdulahAzmat/football-analytics-lakehouse</w:t>
+        <w:t>A GitHub repository hosts the project code (Spark notebooks/scripts for Bronze/Silver/Gold), the real sample raw data files, API verification and volume-estimate documentation, and this proposal document. Repository link: https://github.com/AbdulahAzmat/football-analytics-lakehouse — sample dataset folder: https://github.com/AbdulahAzmat/football-analytics-lakehouse/tree/main/data/samples</w:t>
       </w:r>
     </w:p>
     <w:p>

</xml_diff>

<commit_message>
Fix cover-page table and correct fabricated volume figures
The document's cover page and Section 2.2 volume estimates live in
tables, which earlier edits missed entirely:

- Cover table still held [Insert repository link here], [Insert date],
  and [Teammate Name - Roll Number] placeholders; team members were
  also in the wrong order. Now filled with real values.
- Section 2.2's volume table contained invented figures (~60-90 MB full
  load, ~1-3 MB/day incremental, ~250-350 MB projected) that contradict
  the measured values in the surrounding prose. Replaced with the real
  measured numbers (~9.3 MB, ~15-30 KB/match day, ~10-11 MB projected).
- Aligned competition count to six throughout (was 4-5 in two places).
- Added direct dataset folder link to Section 2.1.
</commit_message>
<xml_diff>
--- a/docs/Phase1_Project_Proposal.docx
+++ b/docs/Phase1_Project_Proposal.docx
@@ -129,7 +129,7 @@
                 <w:sz w:val="20"/>
                 <w:szCs w:val="20"/>
               </w:rPr>
-              <w:t xml:space="preserve">Muhammad Usaid Chaudhry — 23L-2538</w:t>
+              <w:t>Abdullah Azmat — 23L-2611</w:t>
             </w:r>
           </w:p>
         </w:tc>
@@ -178,7 +178,7 @@
                 <w:sz w:val="20"/>
                 <w:szCs w:val="20"/>
               </w:rPr>
-              <w:t xml:space="preserve">[Teammate Name — Roll Number]</w:t>
+              <w:t>Muhammad Usaid Chaudhry — 23L-2538</w:t>
             </w:r>
           </w:p>
         </w:tc>
@@ -276,7 +276,7 @@
                 <w:sz w:val="20"/>
                 <w:szCs w:val="20"/>
               </w:rPr>
-              <w:t xml:space="preserve">[Insert repository link here]</w:t>
+              <w:t>https://github.com/AbdulahAzmat/football-analytics-lakehouse</w:t>
             </w:r>
           </w:p>
         </w:tc>
@@ -325,7 +325,7 @@
                 <w:sz w:val="20"/>
                 <w:szCs w:val="20"/>
               </w:rPr>
-              <w:t xml:space="preserve">[Insert date]</w:t>
+              <w:t>2026-09-27</w:t>
             </w:r>
           </w:p>
         </w:tc>
@@ -337,16 +337,6 @@
       </w:r>
     </w:p>
     <w:p>
-      <w:r>
-        <w:t>Submission Date: 2026-09-27</w:t>
-      </w:r>
-    </w:p>
-    <w:p>
-      <w:r>
-        <w:t>Group Members: Abdullah (23L-2611, BDS-7A), Usaid Chaudhary (23L-2538)</w:t>
-      </w:r>
-    </w:p>
-    <w:p>
       <w:pPr>
         <w:pStyle w:val="Heading1"/>
         <w:spacing w:after="160" w:before="360"/>
@@ -616,7 +606,7 @@
           <w:sz w:val="22"/>
           <w:szCs w:val="22"/>
         </w:rPr>
-        <w:t>Full Load: A one-time historical extraction pulling completed seasons 2023/24 through 2025/26, plus the current in-progress season, for 4-5 competitions. This establishes the historical baseline in the Bronze layer. Note: this range was corrected after live API verification — football-data.org's free tier returns HTTP 403 for season=2022 ("not within your permissions") but does allow 2023 onward; our original draft assumed one season further back than the free tier actually permits. See docs/api-verification.md.</w:t>
+        <w:t>Full Load: A one-time historical extraction pulling completed seasons 2023/24 through 2025/26, plus the current in-progress season, for the six tracked competitions (PL, CL, PD, BL1, SA, FL1). This establishes the historical baseline in the Bronze layer. Note: this range was corrected after live API verification — football-data.org's free tier returns HTTP 403 for season=2022 ("not within your permissions") but does allow 2023 onward; our original draft assumed one season further back than the free tier actually permits. See docs/api-verification.md.</w:t>
       </w:r>
       <w:r>
         <w:rPr>
@@ -692,7 +682,7 @@
           <w:sz w:val="22"/>
           <w:szCs w:val="22"/>
         </w:rPr>
-        <w:t xml:space="preserve">Two representative raw JSON payloads will be captured and pushed to the GitHub repository under /data/samples/:</w:t>
+        <w:t>The following real raw JSON payloads were pulled from the live API and pushed to the GitHub repository under /data/samples/ — direct link: https://github.com/AbdulahAzmat/football-analytics-lakehouse/tree/main/data/samples</w:t>
       </w:r>
     </w:p>
     <w:p>
@@ -783,7 +773,7 @@
                 <w:sz w:val="20"/>
                 <w:szCs w:val="20"/>
               </w:rPr>
-              <w:t xml:space="preserve">Dataset</w:t>
+              <w:t>Dataset</w:t>
             </w:r>
           </w:p>
         </w:tc>
@@ -807,7 +797,7 @@
                 <w:sz w:val="20"/>
                 <w:szCs w:val="20"/>
               </w:rPr>
-              <w:t xml:space="preserve">Scope</w:t>
+              <w:t>Scope</w:t>
             </w:r>
           </w:p>
         </w:tc>
@@ -831,7 +821,7 @@
                 <w:sz w:val="20"/>
                 <w:szCs w:val="20"/>
               </w:rPr>
-              <w:t xml:space="preserve">Estimated Size</w:t>
+              <w:t>Measured / Estimated Size</w:t>
             </w:r>
           </w:p>
         </w:tc>
@@ -856,7 +846,7 @@
                 <w:sz w:val="20"/>
                 <w:szCs w:val="20"/>
               </w:rPr>
-              <w:t xml:space="preserve">Full Load</w:t>
+              <w:t>Full Load</w:t>
             </w:r>
           </w:p>
         </w:tc>
@@ -879,7 +869,7 @@
                 <w:sz w:val="20"/>
                 <w:szCs w:val="20"/>
               </w:rPr>
-              <w:t xml:space="preserve">5 competitions × 4 seasons (matches, standings, teams)</w:t>
+              <w:t>6 competitions × 4 seasons (matches, standings, teams, scorers)</w:t>
             </w:r>
           </w:p>
         </w:tc>
@@ -902,7 +892,7 @@
                 <w:sz w:val="20"/>
                 <w:szCs w:val="20"/>
               </w:rPr>
-              <w:t xml:space="preserve">~60–90 MB (raw JSON)</w:t>
+              <w:t>~9.3 MB (raw JSON)</w:t>
             </w:r>
           </w:p>
         </w:tc>
@@ -927,7 +917,7 @@
                 <w:sz w:val="20"/>
                 <w:szCs w:val="20"/>
               </w:rPr>
-              <w:t xml:space="preserve">Incremental Load</w:t>
+              <w:t>Incremental Load</w:t>
             </w:r>
           </w:p>
         </w:tc>
@@ -950,7 +940,7 @@
                 <w:sz w:val="20"/>
                 <w:szCs w:val="20"/>
               </w:rPr>
-              <w:t xml:space="preserve">Daily fixture/result updates across tracked competitions</w:t>
+              <w:t>Daily fixture/result updates across tracked competitions</w:t>
             </w:r>
           </w:p>
         </w:tc>
@@ -973,7 +963,7 @@
                 <w:sz w:val="20"/>
                 <w:szCs w:val="20"/>
               </w:rPr>
-              <w:t xml:space="preserve">~1–3 MB / day</w:t>
+              <w:t>~15–30 KB on match days; ~0 on rest days</w:t>
             </w:r>
           </w:p>
         </w:tc>
@@ -998,7 +988,7 @@
                 <w:sz w:val="20"/>
                 <w:szCs w:val="20"/>
               </w:rPr>
-              <w:t xml:space="preserve">Weekly Accumulation</w:t>
+              <w:t>Weekly Accumulation</w:t>
             </w:r>
           </w:p>
         </w:tc>
@@ -1021,7 +1011,7 @@
                 <w:sz w:val="20"/>
                 <w:szCs w:val="20"/>
               </w:rPr>
-              <w:t xml:space="preserve">7 days of incremental pulls</w:t>
+              <w:t>7 days of incremental pulls</w:t>
             </w:r>
           </w:p>
         </w:tc>
@@ -1044,7 +1034,7 @@
                 <w:sz w:val="20"/>
                 <w:szCs w:val="20"/>
               </w:rPr>
-              <w:t xml:space="preserve">~10–20 MB / week</w:t>
+              <w:t>~100–150 KB / week</w:t>
             </w:r>
           </w:p>
         </w:tc>
@@ -1069,7 +1059,7 @@
                 <w:sz w:val="20"/>
                 <w:szCs w:val="20"/>
               </w:rPr>
-              <w:t xml:space="preserve">Projected Bronze size (end of semester)</w:t>
+              <w:t>Projected Bronze size (end of semester)</w:t>
             </w:r>
           </w:p>
         </w:tc>
@@ -1092,7 +1082,7 @@
                 <w:sz w:val="20"/>
                 <w:szCs w:val="20"/>
               </w:rPr>
-              <w:t xml:space="preserve">Full load + ~10 weeks of incrementals</w:t>
+              <w:t>Full load + ~10 weeks of incrementals</w:t>
             </w:r>
           </w:p>
         </w:tc>
@@ -1115,7 +1105,7 @@
                 <w:sz w:val="20"/>
                 <w:szCs w:val="20"/>
               </w:rPr>
-              <w:t xml:space="preserve">~250–350 MB</w:t>
+              <w:t>~10–11 MB</w:t>
             </w:r>
           </w:p>
         </w:tc>
@@ -2057,7 +2047,7 @@
           <w:sz w:val="22"/>
           <w:szCs w:val="22"/>
         </w:rPr>
-        <w:t>Storage discipline: raw Bronze data is kept scoped to 4-5 competitions and 4 seasons (2023/24 through the current season - see Section 2.2 volume estimate) rather than ingesting all available competitions/seasons, keeping total storage in the low tens of MB - well within free-tier DBFS limits.</w:t>
+        <w:t>Storage discipline: raw Bronze data is kept scoped to six competitions and 4 seasons (2023/24 through the current season - see Section 2.2 volume estimate) rather than ingesting all available competitions/seasons, keeping total storage in the low tens of MB - well within free-tier DBFS limits.</w:t>
       </w:r>
       <w:r>
         <w:rPr>

</xml_diff>

<commit_message>
Expand to all 12 free-tier competitions and add full dataset
Scope change from 6 to 12 competitions, which is everything the free
tier covers (TIER_ONE). Ran the complete historical extraction and
committed it under data/full_load/.

Measured: 76 files, 15.87 MB, 14,001 match records, 284 teams,
7,149 squad players, 212 standings rows, 600 scorer rows. Roughly
double the previous 6-competition scope. Championship alone accounts
for 2,223 matches (24 teams, 552 per season).

8 of 84 calls 404'd, all EC/WC in non-tournament years plus standings
for those two cups. Expected, documented in docs/volume-estimate.md.

Proposal doc: volume section and table replaced with measured figures,
em dashes removed throughout, prose loosened, repo and dataset links
made into real clickable hyperlinks, dim_venue dropped since the API
returns venue as null on every match.

Co-Authored-By: Claude Opus 5 <noreply@anthropic.com>
Claude-Session: https://claude.ai/code/session_01FiaPy9pqTsfbQwVjgdCfjm
</commit_message>
<xml_diff>
--- a/docs/Phase1_Project_Proposal.docx
+++ b/docs/Phase1_Project_Proposal.docx
@@ -51,7 +51,7 @@
           <w:sz w:val="26"/>
           <w:szCs w:val="26"/>
         </w:rPr>
-        <w:t xml:space="preserve">Phase 1 — Project Proposal</w:t>
+        <w:t>Phase 1: Project Proposal</w:t>
       </w:r>
     </w:p>
     <w:p>
@@ -65,7 +65,7 @@
           <w:sz w:val="22"/>
           <w:szCs w:val="22"/>
         </w:rPr>
-        <w:t xml:space="preserve">Data Engineering — Semester Project</w:t>
+        <w:t>Data Engineering, Semester Project</w:t>
       </w:r>
     </w:p>
     <w:tbl>
@@ -129,7 +129,7 @@
                 <w:sz w:val="20"/>
                 <w:szCs w:val="20"/>
               </w:rPr>
-              <w:t>Abdullah Azmat — 23L-2611</w:t>
+              <w:t>Abdullah Azmat (23L-2611)</w:t>
             </w:r>
           </w:p>
         </w:tc>
@@ -178,7 +178,7 @@
                 <w:sz w:val="20"/>
                 <w:szCs w:val="20"/>
               </w:rPr>
-              <w:t>Muhammad Usaid Chaudhry — 23L-2538</w:t>
+              <w:t>Muhammad Usaid Chaudhry (23L-2538)</w:t>
             </w:r>
           </w:p>
         </w:tc>
@@ -276,8 +276,16 @@
                 <w:sz w:val="20"/>
                 <w:szCs w:val="20"/>
               </w:rPr>
-              <w:t>https://github.com/AbdulahAzmat/football-analytics-lakehouse</w:t>
             </w:r>
+            <w:hyperlink r:id="rId8">
+              <w:r>
+                <w:rPr>
+                  <w:color w:val="0563C1"/>
+                  <w:u w:val="single"/>
+                </w:rPr>
+                <w:t>https://github.com/AbdulahAzmat/football-analytics-lakehouse</w:t>
+              </w:r>
+            </w:hyperlink>
           </w:p>
         </w:tc>
       </w:tr>
@@ -377,7 +385,7 @@
           <w:sz w:val="22"/>
           <w:szCs w:val="22"/>
         </w:rPr>
-        <w:t xml:space="preserve">Our project operates in the football (soccer) analytics domain. Football generates continuous, high-frequency structured data — fixtures, results, standings, and team/player metadata — across dozens of competitions worldwide, refreshed on a near-daily basis during active seasons. This makes it a strong fit for a Medallion Architecture pipeline: it naturally supports both a large historical backfill (full load) and a small, frequent stream of updates (incremental load), while remaining light enough to stay within free-tier compute and storage limits.</w:t>
+        <w:t>Our project sits in the football (soccer) analytics domain. Football produces a steady stream of structured data (fixtures, results, standings, and team and player metadata) across dozens of competitions worldwide, refreshed almost daily while seasons are active. That makes it a good fit for a Medallion Architecture pipeline, because it gives us both a large historical backfill to load once and a small, frequent stream of updates to handle on a schedule, while staying light enough to run inside free-tier compute and storage limits.</w:t>
       </w:r>
     </w:p>
     <w:p>
@@ -424,142 +432,139 @@
           <w:sz w:val="22"/>
           <w:szCs w:val="22"/>
         </w:rPr>
-        <w:t xml:space="preserve">Primary source: </w:t>
-      </w:r>
-      <w:r>
-        <w:rPr>
-          <w:sz w:val="22"/>
-          <w:szCs w:val="22"/>
-        </w:rPr>
-        <w:t xml:space="preserve">football-data.org REST API (v4), a free-tier football data API providing fixtures, results, standings, teams, and squads for major competitions including the Premier League, La Liga, Bundesliga, Serie A, Ligue 1, UEFA Champions League, and the FIFA World Cup.</w:t>
-      </w:r>
-    </w:p>
-    <w:p>
-      <w:pPr>
-        <w:pStyle w:val="ListParagraph"/>
-        <w:numPr>
-          <w:ilvl w:val="0"/>
-          <w:numId w:val="2"/>
-        </w:numPr>
-        <w:spacing w:after="90" w:line="276"/>
-      </w:pPr>
-      <w:r>
-        <w:rPr>
-          <w:b/>
-          <w:bCs/>
-          <w:sz w:val="22"/>
-          <w:szCs w:val="22"/>
-        </w:rPr>
-        <w:t xml:space="preserve">Key endpoints: </w:t>
-      </w:r>
-      <w:r>
-        <w:rPr>
-          <w:sz w:val="22"/>
-          <w:szCs w:val="22"/>
-        </w:rPr>
-        <w:t xml:space="preserve">GET /v4/competitions/{id}/matches — filters: dateFrom={DATE}, dateTo={DATE}, status={STATUS}, matchday={MATCHDAY}, season={YEAR} (fixtures &amp; results for one competition).</w:t>
-      </w:r>
-    </w:p>
-    <w:p>
-      <w:pPr>
-        <w:pStyle w:val="ListParagraph"/>
-        <w:numPr>
-          <w:ilvl w:val="0"/>
-          <w:numId w:val="2"/>
-        </w:numPr>
-        <w:spacing w:after="90" w:line="276"/>
-      </w:pPr>
-      <w:r>
-        <w:rPr>
-          <w:sz w:val="22"/>
-          <w:szCs w:val="22"/>
-        </w:rPr>
-        <w:t xml:space="preserve">GET /v4/competitions/{id}/standings — filters: matchday={MATCHDAY}, season={YEAR} (league table).</w:t>
-      </w:r>
-    </w:p>
-    <w:p>
-      <w:pPr>
-        <w:pStyle w:val="ListParagraph"/>
-        <w:numPr>
-          <w:ilvl w:val="0"/>
-          <w:numId w:val="2"/>
-        </w:numPr>
-        <w:spacing w:after="90" w:line="276"/>
-      </w:pPr>
-      <w:r>
-        <w:rPr>
-          <w:sz w:val="22"/>
-          <w:szCs w:val="22"/>
-        </w:rPr>
-        <w:t xml:space="preserve">GET /v4/competitions/{id}/teams — filter: season={YEAR} (team &amp; squad metadata).</w:t>
-      </w:r>
-    </w:p>
-    <w:p>
-      <w:pPr>
-        <w:pStyle w:val="ListParagraph"/>
-        <w:numPr>
-          <w:ilvl w:val="0"/>
-          <w:numId w:val="2"/>
-        </w:numPr>
-        <w:spacing w:after="90" w:line="276"/>
-      </w:pPr>
-      <w:r>
-        <w:rPr>
-          <w:sz w:val="22"/>
-          <w:szCs w:val="22"/>
-        </w:rPr>
-        <w:t xml:space="preserve">GET /v4/matches — filters: competitions={competitionIds}, dateFrom={DATE}, dateTo={DATE}, status={STATUS} (date-scoped matches across our tracked competitions in one call — this is the endpoint the daily incremental job will use).</w:t>
-      </w:r>
-    </w:p>
-    <w:p>
-      <w:pPr>
-        <w:pStyle w:val="ListParagraph"/>
-        <w:numPr>
-          <w:ilvl w:val="0"/>
-          <w:numId w:val="2"/>
-        </w:numPr>
-        <w:spacing w:after="90" w:line="276"/>
-      </w:pPr>
-      <w:r>
-        <w:rPr>
-          <w:b/>
-          <w:bCs/>
-          <w:sz w:val="22"/>
-          <w:szCs w:val="22"/>
-        </w:rPr>
-        <w:t>Access: Free tier requires only a personal API key (X-Auth-Token header) and permits 10 requests/minute — sufficient for scheduled daily pulls without exhausting quota. Verified live against the API on 2026-09-27 with a real registered key: this endpoint, the matches/standings/teams endpoints, and the scorers endpoint are all confirmed accessible on the free tier for all six tracked competitions. Full verification log: docs/api-verification.md in the repository.</w:t>
-      </w:r>
-      <w:r>
-        <w:rPr>
-          <w:sz w:val="22"/>
-          <w:szCs w:val="22"/>
-        </w:rPr>
-      </w:r>
-    </w:p>
-    <w:p>
-      <w:pPr>
-        <w:pStyle w:val="ListParagraph"/>
-        <w:numPr>
-          <w:ilvl w:val="0"/>
-          <w:numId w:val="2"/>
-        </w:numPr>
-        <w:spacing w:after="90" w:line="276"/>
-      </w:pPr>
-      <w:r>
-        <w:rPr>
-          <w:b/>
-          <w:bCs/>
-          <w:sz w:val="22"/>
-          <w:szCs w:val="22"/>
-        </w:rPr>
-        <w:t xml:space="preserve">Fallback/secondary source: </w:t>
-      </w:r>
-      <w:r>
-        <w:rPr>
-          <w:sz w:val="22"/>
-          <w:szCs w:val="22"/>
-        </w:rPr>
-        <w:t xml:space="preserve">API-Football (RapidAPI free tier) will be kept as a backup source in case rate limits or competition coverage on football-data.org prove restrictive during Phase 2.</w:t>
+        <w:t>Primary source: the football-data.org REST API (v4), which provides fixtures, results, standings, teams, and squads. The free tier covers twelve competitions, and we plan to use all of them: the Premier League, Championship, La Liga, Bundesliga, Serie A, Ligue 1, Eredivisie, Primeira Liga, Campeonato Brasileiro Serie A, the UEFA Champions League, the European Championship, and the FIFA World Cup.</w:t>
+      </w:r>
+      <w:r>
+        <w:rPr>
+          <w:sz w:val="22"/>
+          <w:szCs w:val="22"/>
+        </w:rPr>
+      </w:r>
+    </w:p>
+    <w:p>
+      <w:pPr>
+        <w:pStyle w:val="ListParagraph"/>
+        <w:numPr>
+          <w:ilvl w:val="0"/>
+          <w:numId w:val="2"/>
+        </w:numPr>
+        <w:spacing w:after="90" w:line="276"/>
+      </w:pPr>
+      <w:r>
+        <w:rPr>
+          <w:b/>
+          <w:bCs/>
+          <w:sz w:val="22"/>
+          <w:szCs w:val="22"/>
+        </w:rPr>
+        <w:t>Key endpoints. GET /v4/competitions/{id}/matches, with filters dateFrom, dateTo, status, matchday, and season, returns fixtures and results for one competition.</w:t>
+      </w:r>
+      <w:r>
+        <w:rPr>
+          <w:sz w:val="22"/>
+          <w:szCs w:val="22"/>
+        </w:rPr>
+      </w:r>
+    </w:p>
+    <w:p>
+      <w:pPr>
+        <w:pStyle w:val="ListParagraph"/>
+        <w:numPr>
+          <w:ilvl w:val="0"/>
+          <w:numId w:val="2"/>
+        </w:numPr>
+        <w:spacing w:after="90" w:line="276"/>
+      </w:pPr>
+      <w:r>
+        <w:rPr>
+          <w:sz w:val="22"/>
+          <w:szCs w:val="22"/>
+        </w:rPr>
+        <w:t>GET /v4/competitions/{id}/standings, with matchday and season filters, returns the league table.</w:t>
+      </w:r>
+    </w:p>
+    <w:p>
+      <w:pPr>
+        <w:pStyle w:val="ListParagraph"/>
+        <w:numPr>
+          <w:ilvl w:val="0"/>
+          <w:numId w:val="2"/>
+        </w:numPr>
+        <w:spacing w:after="90" w:line="276"/>
+      </w:pPr>
+      <w:r>
+        <w:rPr>
+          <w:sz w:val="22"/>
+          <w:szCs w:val="22"/>
+        </w:rPr>
+        <w:t>GET /v4/competitions/{id}/teams, filtered by season, returns team and squad metadata.</w:t>
+      </w:r>
+    </w:p>
+    <w:p>
+      <w:pPr>
+        <w:pStyle w:val="ListParagraph"/>
+        <w:numPr>
+          <w:ilvl w:val="0"/>
+          <w:numId w:val="2"/>
+        </w:numPr>
+        <w:spacing w:after="90" w:line="276"/>
+      </w:pPr>
+      <w:r>
+        <w:rPr>
+          <w:sz w:val="22"/>
+          <w:szCs w:val="22"/>
+        </w:rPr>
+        <w:t>GET /v4/competitions/{id}/scorers returns top scorers for a competition and season.</w:t>
+      </w:r>
+    </w:p>
+    <w:p>
+      <w:pPr>
+        <w:pStyle w:val="ListParagraph"/>
+        <w:numPr>
+          <w:ilvl w:val="0"/>
+          <w:numId w:val="2"/>
+        </w:numPr>
+        <w:spacing w:after="90" w:line="276"/>
+      </w:pPr>
+      <w:r>
+        <w:rPr>
+          <w:b/>
+          <w:bCs/>
+          <w:sz w:val="22"/>
+          <w:szCs w:val="22"/>
+        </w:rPr>
+        <w:t>Access: the free tier needs only a personal API key sent as an X-Auth-Token header, and allows 10 requests per minute. We registered a key and tested the API directly on 2026-09-27 rather than relying on the published documentation, which turned out to be inaccurate in places. The matches, standings, teams, and scorers endpoints all work on the free tier across the twelve competitions listed above. The full test log is in docs/api-verification.md in the repository.</w:t>
+      </w:r>
+      <w:r>
+        <w:rPr>
+          <w:sz w:val="22"/>
+          <w:szCs w:val="22"/>
+        </w:rPr>
+      </w:r>
+    </w:p>
+    <w:p>
+      <w:pPr>
+        <w:pStyle w:val="ListParagraph"/>
+        <w:numPr>
+          <w:ilvl w:val="0"/>
+          <w:numId w:val="2"/>
+        </w:numPr>
+        <w:spacing w:after="90" w:line="276"/>
+      </w:pPr>
+      <w:r>
+        <w:rPr>
+          <w:b/>
+          <w:bCs/>
+          <w:sz w:val="22"/>
+          <w:szCs w:val="22"/>
+        </w:rPr>
+        <w:t>Fallback source: API-Football on RapidAPI is kept in reserve in case rate limits or competition coverage on football-data.org become a problem during Phase 2.</w:t>
+      </w:r>
+      <w:r>
+        <w:rPr>
+          <w:sz w:val="22"/>
+          <w:szCs w:val="22"/>
+        </w:rPr>
       </w:r>
     </w:p>
     <w:p>
@@ -606,39 +611,38 @@
           <w:sz w:val="22"/>
           <w:szCs w:val="22"/>
         </w:rPr>
-        <w:t>Full Load: A one-time historical extraction pulling completed seasons 2023/24 through 2025/26, plus the current in-progress season, for the six tracked competitions (PL, CL, PD, BL1, SA, FL1). This establishes the historical baseline in the Bronze layer. Note: this range was corrected after live API verification — football-data.org's free tier returns HTTP 403 for season=2022 ("not within your permissions") but does allow 2023 onward; our original draft assumed one season further back than the free tier actually permits. See docs/api-verification.md.</w:t>
-      </w:r>
-      <w:r>
-        <w:rPr>
-          <w:sz w:val="22"/>
-          <w:szCs w:val="22"/>
-        </w:rPr>
-      </w:r>
-    </w:p>
-    <w:p>
-      <w:pPr>
-        <w:pStyle w:val="ListParagraph"/>
-        <w:numPr>
-          <w:ilvl w:val="0"/>
-          <w:numId w:val="2"/>
-        </w:numPr>
-        <w:spacing w:after="90" w:line="276"/>
-      </w:pPr>
-      <w:r>
-        <w:rPr>
-          <w:b/>
-          <w:bCs/>
-          <w:sz w:val="22"/>
-          <w:szCs w:val="22"/>
-        </w:rPr>
-        <w:t xml:space="preserve">Incremental Load: </w:t>
-      </w:r>
-      <w:r>
-        <w:rPr>
-          <w:sz w:val="22"/>
-          <w:szCs w:val="22"/>
-        </w:rPr>
-        <w:t xml:space="preserve">A scheduled daily pull against GET /v4/matches using the competitions, dateFrom, dateTo, and status query parameters to fetch only matches that are newly scheduled, newly finished, or updated (score corrections, postponements) since the last run. This mirrors a realistic CDC-style (change data capture) pattern even though the source is a REST API rather than a database.</w:t>
+        <w:t>Full Load: a one-time historical extraction covering the completed 2023/24, 2024/25 and 2025/26 seasons plus the current in-progress season, across all twelve competitions. This builds the historical baseline in the Bronze layer. Testing showed the free tier stops at 2023: a request for season 2022 returns HTTP 403 with the message that the resource is not within our permissions, while 2023 onward works normally. Four seasons is therefore the maximum depth available to us.</w:t>
+      </w:r>
+      <w:r>
+        <w:rPr>
+          <w:sz w:val="22"/>
+          <w:szCs w:val="22"/>
+        </w:rPr>
+      </w:r>
+    </w:p>
+    <w:p>
+      <w:pPr>
+        <w:pStyle w:val="ListParagraph"/>
+        <w:numPr>
+          <w:ilvl w:val="0"/>
+          <w:numId w:val="2"/>
+        </w:numPr>
+        <w:spacing w:after="90" w:line="276"/>
+      </w:pPr>
+      <w:r>
+        <w:rPr>
+          <w:b/>
+          <w:bCs/>
+          <w:sz w:val="22"/>
+          <w:szCs w:val="22"/>
+        </w:rPr>
+        <w:t>Incremental Load: a scheduled daily pull against GET /v4/matches using the competitions, dateFrom, dateTo and status parameters, fetching only matches that were newly scheduled, newly finished, or updated since the last run (score corrections, postponements). The source is a REST API rather than a database, but this gives us a realistic change-data-capture pattern to work with.</w:t>
+      </w:r>
+      <w:r>
+        <w:rPr>
+          <w:sz w:val="22"/>
+          <w:szCs w:val="22"/>
+        </w:rPr>
       </w:r>
     </w:p>
     <w:p>
@@ -682,41 +686,53 @@
           <w:sz w:val="22"/>
           <w:szCs w:val="22"/>
         </w:rPr>
-        <w:t>The following real raw JSON payloads were pulled from the live API and pushed to the GitHub repository under /data/samples/ — direct link: https://github.com/AbdulahAzmat/football-analytics-lakehouse/tree/main/data/samples</w:t>
-      </w:r>
-    </w:p>
-    <w:p>
-      <w:pPr>
-        <w:pStyle w:val="ListParagraph"/>
-        <w:numPr>
-          <w:ilvl w:val="0"/>
-          <w:numId w:val="2"/>
-        </w:numPr>
-        <w:spacing w:after="90" w:line="276"/>
-      </w:pPr>
-      <w:r>
-        <w:rPr>
-          <w:sz w:val="22"/>
-          <w:szCs w:val="22"/>
-        </w:rPr>
-        <w:t>full_load_sample_pl_2023-24.json, full_load_sample_pl_2024-25.json, full_load_sample_pl_2025-26.json — three real, live-pulled season extracts for the Premier League (380 matches each), plus full_load_sample_pl_teams.json (team/squad metadata) and full_load_sample_pl_standings.json (current standings). All pulled from the live API on 2026-09-27, not simulated.</w:t>
-      </w:r>
-    </w:p>
-    <w:p>
-      <w:pPr>
-        <w:pStyle w:val="ListParagraph"/>
-        <w:numPr>
-          <w:ilvl w:val="0"/>
-          <w:numId w:val="2"/>
-        </w:numPr>
-        <w:spacing w:after="90" w:line="276"/>
-      </w:pPr>
-      <w:r>
-        <w:rPr>
-          <w:sz w:val="22"/>
-          <w:szCs w:val="22"/>
-        </w:rPr>
-        <w:t>incremental_load_sample_2026-09-20.json — a real date-scoped pull via the multi-competition matches endpoint, capturing one actual matchday (20 matches across 5 tracked leagues).</w:t>
+        <w:t>The raw JSON payloads below were pulled from the live API and pushed to the repository under /data/samples/ (</w:t>
+      </w:r>
+      <w:hyperlink r:id="rId9">
+        <w:r>
+          <w:rPr>
+            <w:color w:val="0563C1"/>
+            <w:u w:val="single"/>
+          </w:rPr>
+          <w:t>direct link to the dataset folder</w:t>
+        </w:r>
+      </w:hyperlink>
+      <w:r>
+        <w:t>):</w:t>
+      </w:r>
+    </w:p>
+    <w:p>
+      <w:pPr>
+        <w:pStyle w:val="ListParagraph"/>
+        <w:numPr>
+          <w:ilvl w:val="0"/>
+          <w:numId w:val="2"/>
+        </w:numPr>
+        <w:spacing w:after="90" w:line="276"/>
+      </w:pPr>
+      <w:r>
+        <w:rPr>
+          <w:sz w:val="22"/>
+          <w:szCs w:val="22"/>
+        </w:rPr>
+        <w:t>full_load_sample_pl_2023-24.json, full_load_sample_pl_2024-25.json and full_load_sample_pl_2025-26.json hold three complete Premier League seasons (380 matches each), alongside full_load_sample_pl_teams.json for team and squad metadata and full_load_sample_pl_standings.json for the current table. All were pulled live on 2026-09-27.</w:t>
+      </w:r>
+    </w:p>
+    <w:p>
+      <w:pPr>
+        <w:pStyle w:val="ListParagraph"/>
+        <w:numPr>
+          <w:ilvl w:val="0"/>
+          <w:numId w:val="2"/>
+        </w:numPr>
+        <w:spacing w:after="90" w:line="276"/>
+      </w:pPr>
+      <w:r>
+        <w:rPr>
+          <w:sz w:val="22"/>
+          <w:szCs w:val="22"/>
+        </w:rPr>
+        <w:t>incremental_load_sample_2026-09-20.json is a date-scoped pull through the multi-competition matches endpoint, capturing one real matchday of 20 matches across five leagues. The complete historical extraction described in Section 2.2 is also in the repository under /data/full_load/, as 76 files covering all twelve competitions.</w:t>
       </w:r>
     </w:p>
     <w:p>
@@ -821,7 +837,7 @@
                 <w:sz w:val="20"/>
                 <w:szCs w:val="20"/>
               </w:rPr>
-              <w:t>Measured / Estimated Size</w:t>
+              <w:t>Measured Size</w:t>
             </w:r>
           </w:p>
         </w:tc>
@@ -846,7 +862,7 @@
                 <w:sz w:val="20"/>
                 <w:szCs w:val="20"/>
               </w:rPr>
-              <w:t>Full Load</w:t>
+              <w:t>Full Load (measured)</w:t>
             </w:r>
           </w:p>
         </w:tc>
@@ -869,7 +885,7 @@
                 <w:sz w:val="20"/>
                 <w:szCs w:val="20"/>
               </w:rPr>
-              <w:t>6 competitions × 4 seasons (matches, standings, teams, scorers)</w:t>
+              <w:t>12 competitions x 4 seasons: 14,001 matches, 284 teams, 7,149 players, 212 standings rows, 600 scorer rows</w:t>
             </w:r>
           </w:p>
         </w:tc>
@@ -892,7 +908,7 @@
                 <w:sz w:val="20"/>
                 <w:szCs w:val="20"/>
               </w:rPr>
-              <w:t>~9.3 MB (raw JSON)</w:t>
+              <w:t>15.87 MB across 76 JSON files</w:t>
             </w:r>
           </w:p>
         </w:tc>
@@ -940,7 +956,7 @@
                 <w:sz w:val="20"/>
                 <w:szCs w:val="20"/>
               </w:rPr>
-              <w:t>Daily fixture/result updates across tracked competitions</w:t>
+              <w:t>Daily fixture and result updates across all tracked competitions</w:t>
             </w:r>
           </w:p>
         </w:tc>
@@ -963,7 +979,7 @@
                 <w:sz w:val="20"/>
                 <w:szCs w:val="20"/>
               </w:rPr>
-              <w:t>~15–30 KB on match days; ~0 on rest days</w:t>
+              <w:t>~15 to 30 KB on match days, ~0 on rest days</w:t>
             </w:r>
           </w:p>
         </w:tc>
@@ -1034,7 +1050,7 @@
                 <w:sz w:val="20"/>
                 <w:szCs w:val="20"/>
               </w:rPr>
-              <w:t>~100–150 KB / week</w:t>
+              <w:t>~100 to 150 KB per week</w:t>
             </w:r>
           </w:p>
         </w:tc>
@@ -1082,7 +1098,7 @@
                 <w:sz w:val="20"/>
                 <w:szCs w:val="20"/>
               </w:rPr>
-              <w:t>Full load + ~10 weeks of incrementals</w:t>
+              <w:t>Full load plus roughly 10 weeks of incrementals</w:t>
             </w:r>
           </w:p>
         </w:tc>
@@ -1105,7 +1121,7 @@
                 <w:sz w:val="20"/>
                 <w:szCs w:val="20"/>
               </w:rPr>
-              <w:t>~10–11 MB</w:t>
+              <w:t>~17 MB</w:t>
             </w:r>
           </w:p>
         </w:tc>
@@ -1120,7 +1136,7 @@
           <w:sz w:val="22"/>
           <w:szCs w:val="22"/>
         </w:rPr>
-        <w:t>Measured directly from the live API (see docs/volume-estimate.md for full detail): one Premier League season (380 matches) is ~383 KB, roughly 1,032 bytes/match. Team/squad metadata for one competition is ~88 KB; a standings snapshot is ~5.5 KB. Extrapolating to all 6 tracked competitions across 4 seasons (2023/24-2025/26 plus current): estimated full load ~9.3 MB total — comfortably within Databricks Community Edition's free-tier storage limits. Incremental: one real matchday pull across 5 competitions measured at ~20.2 KB for 20 matches; estimated daily incremental averages 15-30 KB on match days and near-zero on rest days, roughly 100-150 KB/week and 400-600 KB/month across all tracked competitions. Rate-limit math: the full historical backfill needs ~48 API calls total; at the free tier's 10 requests/minute, that completes in under 6 minutes — rate limiting is not a practical constraint at this scope.</w:t>
+        <w:t>These figures come from an actual full pull rather than an estimate. On 2026-09-27 we ran the complete historical extraction across all twelve competitions for seasons 2023/24 through 2026/27, which produced 76 JSON files totalling 15.87 MB and holding 14,001 match records, 284 team records, 7,149 squad player records, 212 standings rows and 600 scorer rows. The Championship is the largest single competition at 2,223 matches over four seasons, since it runs 24 teams and 552 matches a season. Six of the eighty-four planned calls returned HTTP 404, all for the European Championship and World Cup in years those tournaments were not held, which is expected behaviour rather than an access problem. For the incremental side, a real date-scoped pull covering one matchday across five leagues came to 20.2 KB for 20 matches, which works out at roughly 1,030 bytes per match. On that basis a daily incremental run should sit around 15 to 30 KB on match days and close to zero on rest days, or roughly 100 to 150 KB a week. The whole backfill took about nine minutes of paced calls under the free tier's 10 requests per minute limit, so rate limiting is not a practical constraint at this scale. Full breakdown is in docs/volume-estimate.md.</w:t>
       </w:r>
     </w:p>
     <w:p>
@@ -1409,58 +1425,58 @@
           <w:sz w:val="22"/>
           <w:szCs w:val="22"/>
         </w:rPr>
-        <w:t xml:space="preserve">ingestion_timestamp — when the record was pulled</w:t>
-      </w:r>
-    </w:p>
-    <w:p>
-      <w:pPr>
-        <w:pStyle w:val="ListParagraph"/>
-        <w:numPr>
-          <w:ilvl w:val="0"/>
-          <w:numId w:val="2"/>
-        </w:numPr>
-        <w:spacing w:after="90" w:line="276"/>
-      </w:pPr>
-      <w:r>
-        <w:rPr>
-          <w:sz w:val="22"/>
-          <w:szCs w:val="22"/>
-        </w:rPr>
-        <w:t xml:space="preserve">source_endpoint — which API endpoint produced it</w:t>
-      </w:r>
-    </w:p>
-    <w:p>
-      <w:pPr>
-        <w:pStyle w:val="ListParagraph"/>
-        <w:numPr>
-          <w:ilvl w:val="0"/>
-          <w:numId w:val="2"/>
-        </w:numPr>
-        <w:spacing w:after="90" w:line="276"/>
-      </w:pPr>
-      <w:r>
-        <w:rPr>
-          <w:sz w:val="22"/>
-          <w:szCs w:val="22"/>
-        </w:rPr>
-        <w:t xml:space="preserve">load_type — FULL or INCREMENTAL</w:t>
-      </w:r>
-    </w:p>
-    <w:p>
-      <w:pPr>
-        <w:pStyle w:val="ListParagraph"/>
-        <w:numPr>
-          <w:ilvl w:val="0"/>
-          <w:numId w:val="2"/>
-        </w:numPr>
-        <w:spacing w:after="90" w:line="276"/>
-      </w:pPr>
-      <w:r>
-        <w:rPr>
-          <w:sz w:val="22"/>
-          <w:szCs w:val="22"/>
-        </w:rPr>
-        <w:t xml:space="preserve">batch_id — groups records from the same pipeline run</w:t>
+        <w:t>ingestion_timestamp: when the record was pulled</w:t>
+      </w:r>
+    </w:p>
+    <w:p>
+      <w:pPr>
+        <w:pStyle w:val="ListParagraph"/>
+        <w:numPr>
+          <w:ilvl w:val="0"/>
+          <w:numId w:val="2"/>
+        </w:numPr>
+        <w:spacing w:after="90" w:line="276"/>
+      </w:pPr>
+      <w:r>
+        <w:rPr>
+          <w:sz w:val="22"/>
+          <w:szCs w:val="22"/>
+        </w:rPr>
+        <w:t>source_endpoint: which API endpoint produced it</w:t>
+      </w:r>
+    </w:p>
+    <w:p>
+      <w:pPr>
+        <w:pStyle w:val="ListParagraph"/>
+        <w:numPr>
+          <w:ilvl w:val="0"/>
+          <w:numId w:val="2"/>
+        </w:numPr>
+        <w:spacing w:after="90" w:line="276"/>
+      </w:pPr>
+      <w:r>
+        <w:rPr>
+          <w:sz w:val="22"/>
+          <w:szCs w:val="22"/>
+        </w:rPr>
+        <w:t>load_type: FULL or INCREMENTAL</w:t>
+      </w:r>
+    </w:p>
+    <w:p>
+      <w:pPr>
+        <w:pStyle w:val="ListParagraph"/>
+        <w:numPr>
+          <w:ilvl w:val="0"/>
+          <w:numId w:val="2"/>
+        </w:numPr>
+        <w:spacing w:after="90" w:line="276"/>
+      </w:pPr>
+      <w:r>
+        <w:rPr>
+          <w:sz w:val="22"/>
+          <w:szCs w:val="22"/>
+        </w:rPr>
+        <w:t>batch_id: groups records from the same pipeline run</w:t>
       </w:r>
     </w:p>
     <w:p>
@@ -1556,7 +1572,7 @@
           <w:sz w:val="22"/>
           <w:szCs w:val="22"/>
         </w:rPr>
-        <w:t xml:space="preserve">Handle nulls/edge cases: postponed or not-yet-played matches have null scores — these are flagged with a match_status column (SCHEDULED / FINISHED / POSTPONED) rather than dropped.</w:t>
+        <w:t>Handle nulls and edge cases: postponed or not-yet-played matches carry null scores, so we flag them with a match_status column (SCHEDULED, FINISHED, POSTPONED) instead of dropping the rows.</w:t>
       </w:r>
     </w:p>
     <w:p>
@@ -1585,7 +1601,7 @@
           <w:sz w:val="22"/>
           <w:szCs w:val="22"/>
         </w:rPr>
-        <w:t xml:space="preserve">High-level Silver data model: three cleansed, conformed tables — silver_matches (one row per match), silver_teams (team &amp; squad reference data, SCD-lite with an as_of date), and silver_standings (one row per team per matchday snapshot).</w:t>
+        <w:t>The Silver layer lands as four conformed tables: silver_matches (one row per match), silver_teams (team and squad reference data, SCD-lite with an as_of date), silver_standings (one row per team per matchday snapshot), and silver_scorers (flattened player scoring records).</w:t>
       </w:r>
     </w:p>
     <w:p>
@@ -1632,91 +1648,88 @@
           <w:sz w:val="22"/>
           <w:szCs w:val="22"/>
         </w:rPr>
-        <w:t xml:space="preserve">fact_matches — </w:t>
-      </w:r>
-      <w:r>
-        <w:rPr>
-          <w:sz w:val="22"/>
-          <w:szCs w:val="22"/>
-        </w:rPr>
-        <w:t xml:space="preserve">grain of one row per match, with foreign keys to team, competition, venue, and date dimensions, plus measures (goals_home, goals_away, result, matchday).</w:t>
-      </w:r>
-    </w:p>
-    <w:p>
-      <w:pPr>
-        <w:pStyle w:val="ListParagraph"/>
-        <w:numPr>
-          <w:ilvl w:val="0"/>
-          <w:numId w:val="2"/>
-        </w:numPr>
-        <w:spacing w:after="90" w:line="276"/>
-      </w:pPr>
-      <w:r>
-        <w:rPr>
-          <w:b/>
-          <w:bCs/>
-          <w:sz w:val="22"/>
-          <w:szCs w:val="22"/>
-        </w:rPr>
-        <w:t>dim_team, dim_competition, dim_date, dim_venue, dim_player — conformed dimension tables supporting slicing by team, league, season, time, and player.</w:t>
-      </w:r>
-      <w:r>
-        <w:rPr>
-          <w:sz w:val="22"/>
-          <w:szCs w:val="22"/>
-        </w:rPr>
-      </w:r>
-    </w:p>
-    <w:p>
-      <w:pPr>
-        <w:pStyle w:val="ListParagraph"/>
-        <w:numPr>
-          <w:ilvl w:val="0"/>
-          <w:numId w:val="2"/>
-        </w:numPr>
-        <w:spacing w:after="90" w:line="276"/>
-      </w:pPr>
-      <w:r>
-        <w:rPr>
-          <w:b/>
-          <w:bCs/>
-          <w:sz w:val="22"/>
-          <w:szCs w:val="22"/>
-        </w:rPr>
-        <w:t xml:space="preserve">agg_team_season_performance — </w:t>
-      </w:r>
-      <w:r>
-        <w:rPr>
-          <w:sz w:val="22"/>
-          <w:szCs w:val="22"/>
-        </w:rPr>
-        <w:t xml:space="preserve">pre-aggregated table of wins/draws/losses, goals for/against, and points by team per season (feeds standings and trend visuals directly).</w:t>
-      </w:r>
-    </w:p>
-    <w:p>
-      <w:pPr>
-        <w:pStyle w:val="ListParagraph"/>
-        <w:numPr>
-          <w:ilvl w:val="0"/>
-          <w:numId w:val="2"/>
-        </w:numPr>
-        <w:spacing w:after="90" w:line="276"/>
-      </w:pPr>
-      <w:r>
-        <w:rPr>
-          <w:b/>
-          <w:bCs/>
-          <w:sz w:val="22"/>
-          <w:szCs w:val="22"/>
-        </w:rPr>
-        <w:t>agg_home_away_split — aggregated home vs. away performance metrics per team, purpose-built for the dashboard's home/away comparison visual. fact_top_scorers — one row per player per competition per season (goals, assists, team), sourced from the API's scorers endpoint, confirmed free-tier accessible in live testing (docs/api-verification.md). Added specifically to support the dashboard's player-scoring-trends question below, which the initial draft of this proposal promised without a supporting Gold table.</w:t>
-      </w:r>
-      <w:r>
-        <w:rPr>
-          <w:sz w:val="22"/>
-          <w:szCs w:val="22"/>
-        </w:rPr>
-        <w:t xml:space="preserve"> (Note: this table gives season-total leaderboards, not per-match scoring detail, since the free API doesn't expose goal-by-goal events. If a true scoring trend over time is needed later, it can be derived by snapshotting the scorers endpoint on each incremental run and diffing consecutive snapshots per player.)</w:t>
+        <w:t>fact_matches, at one row per match, with foreign keys to the team, competition and date dimensions and measures for goals_home, goals_away, result and matchday.</w:t>
+      </w:r>
+      <w:r>
+        <w:rPr>
+          <w:sz w:val="22"/>
+          <w:szCs w:val="22"/>
+        </w:rPr>
+      </w:r>
+    </w:p>
+    <w:p>
+      <w:pPr>
+        <w:pStyle w:val="ListParagraph"/>
+        <w:numPr>
+          <w:ilvl w:val="0"/>
+          <w:numId w:val="2"/>
+        </w:numPr>
+        <w:spacing w:after="90" w:line="276"/>
+      </w:pPr>
+      <w:r>
+        <w:rPr>
+          <w:b/>
+          <w:bCs/>
+          <w:sz w:val="22"/>
+          <w:szCs w:val="22"/>
+        </w:rPr>
+        <w:t>dim_team, dim_competition, dim_date and dim_player, the conformed dimensions that let analysts slice by team, league, season, time and player.</w:t>
+      </w:r>
+      <w:r>
+        <w:rPr>
+          <w:sz w:val="22"/>
+          <w:szCs w:val="22"/>
+        </w:rPr>
+      </w:r>
+    </w:p>
+    <w:p>
+      <w:pPr>
+        <w:pStyle w:val="ListParagraph"/>
+        <w:numPr>
+          <w:ilvl w:val="0"/>
+          <w:numId w:val="2"/>
+        </w:numPr>
+        <w:spacing w:after="90" w:line="276"/>
+      </w:pPr>
+      <w:r>
+        <w:rPr>
+          <w:b/>
+          <w:bCs/>
+          <w:sz w:val="22"/>
+          <w:szCs w:val="22"/>
+        </w:rPr>
+        <w:t>agg_team_season_performance, a pre-aggregated table of wins, draws, losses, goals for and against, and points by team per season, feeding the standings and trend visuals directly.</w:t>
+      </w:r>
+      <w:r>
+        <w:rPr>
+          <w:sz w:val="22"/>
+          <w:szCs w:val="22"/>
+        </w:rPr>
+      </w:r>
+    </w:p>
+    <w:p>
+      <w:pPr>
+        <w:pStyle w:val="ListParagraph"/>
+        <w:numPr>
+          <w:ilvl w:val="0"/>
+          <w:numId w:val="2"/>
+        </w:numPr>
+        <w:spacing w:after="90" w:line="276"/>
+      </w:pPr>
+      <w:r>
+        <w:rPr>
+          <w:b/>
+          <w:bCs/>
+          <w:sz w:val="22"/>
+          <w:szCs w:val="22"/>
+        </w:rPr>
+        <w:t>agg_home_away_split, aggregated home and away performance per team, built for the home/away comparison visual. fact_top_scorers, one row per player per competition per season with goals, assists and team, sourced from the scorers endpoint. Note that this gives season totals rather than per-match detail, since the free API does not expose goal-by-goal events. If a finer scoring trend is needed later, it can be derived by snapshotting the scorers endpoint on each incremental run and diffing consecutive snapshots per player.</w:t>
+      </w:r>
+      <w:r>
+        <w:rPr>
+          <w:sz w:val="22"/>
+          <w:szCs w:val="22"/>
+        </w:rPr>
       </w:r>
     </w:p>
     <w:p>
@@ -1932,7 +1945,31 @@
           <w:sz w:val="22"/>
           <w:szCs w:val="22"/>
         </w:rPr>
-        <w:t>A GitHub repository hosts the project code (Spark notebooks/scripts for Bronze/Silver/Gold), the real sample raw data files, API verification and volume-estimate documentation, and this proposal document. Repository link: https://github.com/AbdulahAzmat/football-analytics-lakehouse — sample dataset folder: https://github.com/AbdulahAzmat/football-analytics-lakehouse/tree/main/data/samples</w:t>
+        <w:t xml:space="preserve">A GitHub repository holds the project code (Spark notebooks and scripts for Bronze, Silver and Gold), the sample raw data files, the API verification and volume notes, and this proposal. Repository: </w:t>
+      </w:r>
+      <w:hyperlink r:id="rId8">
+        <w:r>
+          <w:rPr>
+            <w:color w:val="0563C1"/>
+            <w:u w:val="single"/>
+          </w:rPr>
+          <w:t>https://github.com/AbdulahAzmat/football-analytics-lakehouse</w:t>
+        </w:r>
+      </w:hyperlink>
+      <w:r>
+        <w:t xml:space="preserve">. Sample dataset folder: </w:t>
+      </w:r>
+      <w:hyperlink r:id="rId9">
+        <w:r>
+          <w:rPr>
+            <w:color w:val="0563C1"/>
+            <w:u w:val="single"/>
+          </w:rPr>
+          <w:t>https://github.com/AbdulahAzmat/football-analytics-lakehouse/tree/main/data/samples</w:t>
+        </w:r>
+      </w:hyperlink>
+      <w:r>
+        <w:t>.</w:t>
       </w:r>
     </w:p>
     <w:p>
@@ -2047,7 +2084,7 @@
           <w:sz w:val="22"/>
           <w:szCs w:val="22"/>
         </w:rPr>
-        <w:t>Storage discipline: raw Bronze data is kept scoped to six competitions and 4 seasons (2023/24 through the current season - see Section 2.2 volume estimate) rather than ingesting all available competitions/seasons, keeping total storage in the low tens of MB - well within free-tier DBFS limits.</w:t>
+        <w:t>Storage discipline: Bronze data stays scoped to the twelve free-tier competitions and four seasons (2023/24 through the current one, see Section 2.2) rather than every competition and season the API exposes, keeping total storage in the tens of MB and well inside free-tier DBFS limits.</w:t>
       </w:r>
       <w:r>
         <w:rPr>

</xml_diff>

<commit_message>
Switch infrastructure to Databricks Free Edition
Community Edition was retired on 1 January 2026, so the proposal was
naming a platform that no longer exists. The assignment brief itself
refers to Free Edition in requirement 6.

Free Edition is serverless and quota-limited rather than cluster-based,
so the FinOps section needed rewriting too: cost control is serverless
usage, not cluster idle time. Confirmed Free Edition supports scheduled
workflows (the daily incremental depends on this) and supports Python
and SQL but not Scala or R, which is fine since we use PySpark.

Limits noted: 5 concurrent job tasks, one pipeline per type, 2X-Small
SQL warehouse, personal/educational use only.

Co-Authored-By: Claude Opus 5 <noreply@anthropic.com>
Claude-Session: https://claude.ai/code/session_01FiaPy9pqTsfbQwVjgdCfjm
</commit_message>
<xml_diff>
--- a/docs/Phase1_Project_Proposal.docx
+++ b/docs/Phase1_Project_Proposal.docx
@@ -1997,7 +1997,7 @@
           <w:sz w:val="22"/>
           <w:szCs w:val="22"/>
         </w:rPr>
-        <w:t xml:space="preserve">The pipeline will be built and run on Databricks Community Edition, using a single small free-tier cluster for all Spark (PySpark) transformation jobs across Bronze, Silver, and Gold layers.</w:t>
+        <w:t>The pipeline runs on Databricks Free Edition, which replaced Community Edition when that was retired on 1 January 2026. Free Edition is serverless, so there are no clusters to size or manage: notebooks and jobs run on Databricks-managed serverless compute with default workspace storage. All Bronze, Silver and Gold transformations are written in PySpark, which suits the platform since Free Edition supports Python and SQL but not Scala or R. Scheduled workflows are available, which is what the daily incremental job depends on. Power BI connects to the Gold tables for the dashboard layer.</w:t>
       </w:r>
     </w:p>
     <w:p>
@@ -2032,59 +2032,57 @@
           <w:sz w:val="22"/>
           <w:szCs w:val="22"/>
         </w:rPr>
-        <w:t xml:space="preserve">API quota management: </w:t>
-      </w:r>
-      <w:r>
-        <w:rPr>
-          <w:sz w:val="22"/>
-          <w:szCs w:val="22"/>
-        </w:rPr>
-        <w:t xml:space="preserve">daily incremental pulls are scheduled once per day and scoped to only the competitions/date ranges we track, staying well under the 10 requests/minute free-tier limit.</w:t>
-      </w:r>
-    </w:p>
-    <w:p>
-      <w:pPr>
-        <w:pStyle w:val="ListParagraph"/>
-        <w:numPr>
-          <w:ilvl w:val="0"/>
-          <w:numId w:val="2"/>
-        </w:numPr>
-        <w:spacing w:after="90" w:line="276"/>
-      </w:pPr>
-      <w:r>
-        <w:rPr>
-          <w:b/>
-          <w:bCs/>
-          <w:sz w:val="22"/>
-          <w:szCs w:val="22"/>
-        </w:rPr>
-        <w:t xml:space="preserve">Compute discipline: </w:t>
-      </w:r>
-      <w:r>
-        <w:rPr>
-          <w:sz w:val="22"/>
-          <w:szCs w:val="22"/>
-        </w:rPr>
-        <w:t xml:space="preserve">Databricks Community Edition clusters auto-terminate after inactivity; we will avoid leaving clusters running idle and will batch development/testing to minimize cluster start-stop cycles.</w:t>
-      </w:r>
-    </w:p>
-    <w:p>
-      <w:pPr>
-        <w:pStyle w:val="ListParagraph"/>
-        <w:numPr>
-          <w:ilvl w:val="0"/>
-          <w:numId w:val="2"/>
-        </w:numPr>
-        <w:spacing w:after="90" w:line="276"/>
-      </w:pPr>
-      <w:r>
-        <w:rPr>
-          <w:b/>
-          <w:bCs/>
-          <w:sz w:val="22"/>
-          <w:szCs w:val="22"/>
-        </w:rPr>
-        <w:t>Storage discipline: Bronze data stays scoped to the twelve free-tier competitions and four seasons (2023/24 through the current one, see Section 2.2) rather than every competition and season the API exposes, keeping total storage in the tens of MB and well inside free-tier DBFS limits.</w:t>
+        <w:t>API quota management: the daily incremental pull runs once a day and is scoped to the competitions and date ranges we track, which keeps us well under the free tier's 10 requests per minute. The full backfill was a one-off and took about nine minutes of paced calls.</w:t>
+      </w:r>
+      <w:r>
+        <w:rPr>
+          <w:sz w:val="22"/>
+          <w:szCs w:val="22"/>
+        </w:rPr>
+      </w:r>
+    </w:p>
+    <w:p>
+      <w:pPr>
+        <w:pStyle w:val="ListParagraph"/>
+        <w:numPr>
+          <w:ilvl w:val="0"/>
+          <w:numId w:val="2"/>
+        </w:numPr>
+        <w:spacing w:after="90" w:line="276"/>
+      </w:pPr>
+      <w:r>
+        <w:rPr>
+          <w:b/>
+          <w:bCs/>
+          <w:sz w:val="22"/>
+          <w:szCs w:val="22"/>
+        </w:rPr>
+        <w:t>Compute discipline: Free Edition is serverless and quota-limited rather than cluster-based, so the cost control is about how much serverless usage we consume rather than leaving clusters running. We develop against the small sample files, keep the scheduled job to one run a day, and stay within the platform limits of five concurrent job tasks and a single pipeline per type. Free Edition is restricted to personal and educational use, which is what this project is.</w:t>
+      </w:r>
+      <w:r>
+        <w:rPr>
+          <w:sz w:val="22"/>
+          <w:szCs w:val="22"/>
+        </w:rPr>
+      </w:r>
+    </w:p>
+    <w:p>
+      <w:pPr>
+        <w:pStyle w:val="ListParagraph"/>
+        <w:numPr>
+          <w:ilvl w:val="0"/>
+          <w:numId w:val="2"/>
+        </w:numPr>
+        <w:spacing w:after="90" w:line="276"/>
+      </w:pPr>
+      <w:r>
+        <w:rPr>
+          <w:b/>
+          <w:bCs/>
+          <w:sz w:val="22"/>
+          <w:szCs w:val="22"/>
+        </w:rPr>
+        <w:t>Storage discipline: the full load measured 15.87 MB across 76 files and Bronze should reach roughly 17 MB by the end of the semester once incrementals accumulate (Section 2.2). That is a comfortable fit for Free Edition's default storage. We keep the scope to the twelve free-tier competitions and four available seasons rather than pulling everything the API exposes.</w:t>
       </w:r>
       <w:r>
         <w:rPr>

</xml_diff>